<commit_message>
Clean up project structure: Remove temporary and duplicate files
Removed:
- Temporary image files (temp_*.jpg)
- Duplicate test files (test_api.py, test_predict.py, test_production.py, test_torch.py)
- Redundant root-level files (main.py, utils.py, run_train.py, project_report.py, report.txt)
- Unwanted folders (skin disease/, .streamlit/)
- Test results output files

Reason: Remove build artifacts and intermediate files to keep repository clean
Impact: Cleaner project structure, easier to navigate
</commit_message>
<xml_diff>
--- a/References/SKIN CANCER DISEASE PREDICTION SYSTEM_ Adit Jain.docx
+++ b/References/SKIN CANCER DISEASE PREDICTION SYSTEM_ Adit Jain.docx
@@ -2281,6 +2281,174 @@
           <w:szCs w:val="24"/>
         </w:rPr>
         <w:t>Real-time image capture and prediction.</w:t>
+      </w:r>
+    </w:p>
+    <w:p>
+      <w:pPr>
+        <w:rPr>
+          <w:sz w:val="24"/>
+          <w:szCs w:val="24"/>
+        </w:rPr>
+      </w:pPr>
+    </w:p>
+    <w:p>
+      <w:pPr>
+        <w:rPr>
+          <w:sz w:val="24"/>
+          <w:szCs w:val="24"/>
+        </w:rPr>
+      </w:pPr>
+    </w:p>
+    <w:p>
+      <w:pPr>
+        <w:rPr>
+          <w:sz w:val="24"/>
+          <w:szCs w:val="24"/>
+        </w:rPr>
+      </w:pPr>
+    </w:p>
+    <w:p>
+      <w:pPr>
+        <w:rPr>
+          <w:sz w:val="24"/>
+          <w:szCs w:val="24"/>
+        </w:rPr>
+      </w:pPr>
+    </w:p>
+    <w:p>
+      <w:pPr>
+        <w:rPr>
+          <w:sz w:val="36"/>
+          <w:szCs w:val="36"/>
+        </w:rPr>
+      </w:pPr>
+    </w:p>
+    <w:p>
+      <w:pPr>
+        <w:rPr>
+          <w:sz w:val="36"/>
+          <w:szCs w:val="36"/>
+        </w:rPr>
+      </w:pPr>
+    </w:p>
+    <w:p>
+      <w:pPr>
+        <w:rPr>
+          <w:sz w:val="36"/>
+          <w:szCs w:val="36"/>
+        </w:rPr>
+      </w:pPr>
+    </w:p>
+    <w:p>
+      <w:pPr>
+        <w:rPr>
+          <w:sz w:val="36"/>
+          <w:szCs w:val="36"/>
+        </w:rPr>
+      </w:pPr>
+    </w:p>
+    <w:p>
+      <w:pPr>
+        <w:rPr>
+          <w:sz w:val="36"/>
+          <w:szCs w:val="36"/>
+        </w:rPr>
+      </w:pPr>
+    </w:p>
+    <w:p>
+      <w:pPr>
+        <w:rPr>
+          <w:sz w:val="36"/>
+          <w:szCs w:val="36"/>
+        </w:rPr>
+      </w:pPr>
+    </w:p>
+    <w:p>
+      <w:pPr>
+        <w:rPr>
+          <w:sz w:val="36"/>
+          <w:szCs w:val="36"/>
+        </w:rPr>
+      </w:pPr>
+    </w:p>
+    <w:p>
+      <w:pPr>
+        <w:rPr>
+          <w:sz w:val="36"/>
+          <w:szCs w:val="36"/>
+        </w:rPr>
+      </w:pPr>
+    </w:p>
+    <w:p>
+      <w:pPr>
+        <w:rPr>
+          <w:sz w:val="36"/>
+          <w:szCs w:val="36"/>
+        </w:rPr>
+      </w:pPr>
+    </w:p>
+    <w:p>
+      <w:pPr>
+        <w:rPr>
+          <w:sz w:val="24"/>
+          <w:szCs w:val="24"/>
+        </w:rPr>
+      </w:pPr>
+      <w:r>
+        <w:rPr>
+          <w:sz w:val="36"/>
+          <w:szCs w:val="36"/>
+        </w:rPr>
+        <w:lastRenderedPageBreak/>
+        <w:t>Class</w:t>
+      </w:r>
+      <w:r>
+        <w:rPr>
+          <w:sz w:val="36"/>
+          <w:szCs w:val="36"/>
+        </w:rPr>
+        <w:t xml:space="preserve"> Diagram:</w:t>
+      </w:r>
+      <w:r>
+        <w:rPr>
+          <w:sz w:val="24"/>
+          <w:szCs w:val="24"/>
+        </w:rPr>
+        <w:drawing>
+          <wp:inline distT="0" distB="0" distL="0" distR="0" wp14:anchorId="5F37DEC8" wp14:editId="6D6421E9">
+            <wp:extent cx="5731510" cy="5188585"/>
+            <wp:effectExtent l="0" t="0" r="2540" b="0"/>
+            <wp:docPr id="1064821545" name="Picture 1"/>
+            <wp:cNvGraphicFramePr>
+              <a:graphicFrameLocks xmlns:a="http://schemas.openxmlformats.org/drawingml/2006/main" noChangeAspect="1"/>
+            </wp:cNvGraphicFramePr>
+            <a:graphic xmlns:a="http://schemas.openxmlformats.org/drawingml/2006/main">
+              <a:graphicData uri="http://schemas.openxmlformats.org/drawingml/2006/picture">
+                <pic:pic xmlns:pic="http://schemas.openxmlformats.org/drawingml/2006/picture">
+                  <pic:nvPicPr>
+                    <pic:cNvPr id="1064821545" name=""/>
+                    <pic:cNvPicPr/>
+                  </pic:nvPicPr>
+                  <pic:blipFill>
+                    <a:blip r:embed="rId6"/>
+                    <a:stretch>
+                      <a:fillRect/>
+                    </a:stretch>
+                  </pic:blipFill>
+                  <pic:spPr>
+                    <a:xfrm>
+                      <a:off x="0" y="0"/>
+                      <a:ext cx="5731510" cy="5188585"/>
+                    </a:xfrm>
+                    <a:prstGeom prst="rect">
+                      <a:avLst/>
+                    </a:prstGeom>
+                  </pic:spPr>
+                </pic:pic>
+              </a:graphicData>
+            </a:graphic>
+          </wp:inline>
+        </w:drawing>
       </w:r>
     </w:p>
     <w:sectPr>

</xml_diff>